<commit_message>
Lab 6 & 7
</commit_message>
<xml_diff>
--- a/docs/Lab-Submissions/Lab-6.docx
+++ b/docs/Lab-Submissions/Lab-6.docx
@@ -4,13 +4,13 @@
   <w:body>
     <w:p>
       <w:r>
-        <w:t xml:space="preserve">Lab-5 Group 8                                                                                                                                  </w:t>
-      </w:r>
-      <w:r>
-        <w:t>26</w:t>
-      </w:r>
-      <w:r>
-        <w:t>/02/2026</w:t>
+        <w:t>Lab-</w:t>
+      </w:r>
+      <w:r>
+        <w:t>6</w:t>
+      </w:r>
+      <w:r>
+        <w:t xml:space="preserve"> Group 8                                                                                                                                  26/02/2026</w:t>
       </w:r>
     </w:p>
     <w:p>
@@ -304,21 +304,7 @@
           <w:rFonts w:cs="Times New Roman"/>
           <w:lang w:val="en-US"/>
         </w:rPr>
-        <w:t>3.</w:t>
-      </w:r>
-      <w:r>
-        <w:rPr>
-          <w:rFonts w:cs="Times New Roman"/>
-          <w:lang w:val="en-US"/>
-        </w:rPr>
-        <w:t>2</w:t>
-      </w:r>
-      <w:r>
-        <w:rPr>
-          <w:rFonts w:cs="Times New Roman"/>
-          <w:lang w:val="en-US"/>
-        </w:rPr>
-        <w:t xml:space="preserve"> </w:t>
+        <w:t xml:space="preserve">3.2 </w:t>
       </w:r>
       <w:r>
         <w:rPr>

</xml_diff>